<commit_message>
Updated AC peer to peer tutorial
</commit_message>
<xml_diff>
--- a/Tutorial_Twist_Board_Communications_HAAS_20250617.docx
+++ b/Tutorial_Twist_Board_Communications_HAAS_20250617.docx
@@ -13,6 +13,7 @@
       <w:bookmarkEnd w:id="0"/>
       <w:r>
         <w:rPr>
+          <w:noProof/>
           <w:sz w:val="72"/>
         </w:rPr>
         <mc:AlternateContent>
@@ -70,6 +71,7 @@
                           <w:p>
                             <w:r>
                               <w:rPr>
+                                <w:noProof/>
                                 <w:sz w:val="72"/>
                               </w:rPr>
                               <w:drawing>
@@ -141,6 +143,7 @@
                     <w:p>
                       <w:r>
                         <w:rPr>
+                          <w:noProof/>
                           <w:sz w:val="72"/>
                         </w:rPr>
                         <w:drawing>
@@ -189,6 +192,9 @@
         </mc:AlternateContent>
       </w:r>
       <w:r>
+        <w:rPr>
+          <w:noProof/>
+        </w:rPr>
         <mc:AlternateContent>
           <mc:Choice Requires="wps">
             <w:drawing>
@@ -243,6 +249,9 @@
                         <w:txbxContent>
                           <w:p>
                             <w:r>
+                              <w:rPr>
+                                <w:noProof/>
+                              </w:rPr>
                               <w:drawing>
                                 <wp:inline distT="0" distB="0" distL="0" distR="0" wp14:anchorId="0D1AE063" wp14:editId="5B1EFCD8">
                                   <wp:extent cx="2942377" cy="1499250"/>
@@ -307,6 +316,9 @@
                   <w:txbxContent>
                     <w:p>
                       <w:r>
+                        <w:rPr>
+                          <w:noProof/>
+                        </w:rPr>
                         <w:drawing>
                           <wp:inline distT="0" distB="0" distL="0" distR="0" wp14:anchorId="0D1AE063" wp14:editId="5B1EFCD8">
                             <wp:extent cx="2942377" cy="1499250"/>
@@ -447,6 +459,9 @@
     <w:p/>
     <w:p>
       <w:r>
+        <w:rPr>
+          <w:noProof/>
+        </w:rPr>
         <mc:AlternateContent>
           <mc:Choice Requires="wps">
             <w:drawing>
@@ -501,6 +516,9 @@
                         <w:txbxContent>
                           <w:p>
                             <w:r>
+                              <w:rPr>
+                                <w:noProof/>
+                              </w:rPr>
                               <w:drawing>
                                 <wp:inline distT="0" distB="0" distL="0" distR="0" wp14:anchorId="4ED6E43A" wp14:editId="24FE6548">
                                   <wp:extent cx="3621196" cy="5551931"/>
@@ -565,6 +583,9 @@
                   <w:txbxContent>
                     <w:p>
                       <w:r>
+                        <w:rPr>
+                          <w:noProof/>
+                        </w:rPr>
                         <w:drawing>
                           <wp:inline distT="0" distB="0" distL="0" distR="0" wp14:anchorId="4ED6E43A" wp14:editId="24FE6548">
                             <wp:extent cx="3621196" cy="5551931"/>
@@ -1413,23 +1434,7 @@
           <w:color w:val="1F2328"/>
           <w:sz w:val="22"/>
         </w:rPr>
-        <w:t xml:space="preserve">The goal of this tutorial is to start using the OnwTech TWIST boards </w:t>
-      </w:r>
-      <w:r>
-        <w:rPr>
-          <w:rFonts w:asciiTheme="minorHAnsi" w:hAnsiTheme="minorHAnsi" w:cstheme="minorHAnsi"/>
-          <w:color w:val="1F2328"/>
-          <w:sz w:val="22"/>
-        </w:rPr>
-        <w:t>with communication protocols</w:t>
-      </w:r>
-      <w:r>
-        <w:rPr>
-          <w:rFonts w:asciiTheme="minorHAnsi" w:hAnsiTheme="minorHAnsi" w:cstheme="minorHAnsi"/>
-          <w:color w:val="1F2328"/>
-          <w:sz w:val="22"/>
-        </w:rPr>
-        <w:t>. Please refer to the “Tutorial_Twist_Board” for learning how to use the Twist board before starting this new series of tutorials.</w:t>
+        <w:t>The goal of this tutorial is to start using the OnwTech TWIST boards with communication protocols. Please refer to the “Tutorial_Twist_Board” for learning how to use the Twist board before starting this new series of tutorials.</w:t>
       </w:r>
     </w:p>
     <w:p>
@@ -1522,16 +1527,7 @@
           <w:sz w:val="22"/>
           <w:szCs w:val="22"/>
         </w:rPr>
-        <w:t xml:space="preserve">implement a system with two power electronics converters: a </w:t>
-      </w:r>
-      <w:r>
-        <w:rPr>
-          <w:rFonts w:asciiTheme="minorHAnsi" w:hAnsiTheme="minorHAnsi" w:cstheme="minorHAnsi"/>
-          <w:color w:val="1F2328"/>
-          <w:sz w:val="22"/>
-          <w:szCs w:val="22"/>
-        </w:rPr>
-        <w:t>DC/AC converter producing a certain power and informing an AC/DC converter that it can consume this reference power.</w:t>
+        <w:t>implement a system with two power electronics converters: a DC/AC converter producing a certain power and informing an AC/DC converter that it can consume this reference power.</w:t>
       </w:r>
     </w:p>
     <w:p>
@@ -1548,6 +1544,7 @@
       <w:r>
         <w:rPr>
           <w:rFonts w:asciiTheme="minorHAnsi" w:hAnsiTheme="minorHAnsi" w:cstheme="minorHAnsi"/>
+          <w:noProof/>
           <w:color w:val="1F2328"/>
           <w:sz w:val="22"/>
           <w:szCs w:val="22"/>
@@ -1607,16 +1604,7 @@
           <w:sz w:val="22"/>
           <w:szCs w:val="22"/>
         </w:rPr>
-        <w:t>The DC/AC converter's task is to generate AC power for use in the electrical network</w:t>
-      </w:r>
-      <w:r>
-        <w:rPr>
-          <w:rFonts w:asciiTheme="minorHAnsi" w:hAnsiTheme="minorHAnsi" w:cstheme="minorHAnsi"/>
-          <w:color w:val="1F2328"/>
-          <w:sz w:val="22"/>
-          <w:szCs w:val="22"/>
-        </w:rPr>
-        <w:t>, being connected to a DC generation like a solar panel for example (in our case the generation is going to be the DC power supply). The DC/AC converter is also called the SERVER converter in this tutorial.</w:t>
+        <w:t>The DC/AC converter's task is to generate AC power for use in the electrical network, being connected to a DC generation like a solar panel for example (in our case the generation is going to be the DC power supply). The DC/AC converter is also called the SERVER converter in this tutorial.</w:t>
       </w:r>
     </w:p>
     <w:p>
@@ -1637,16 +1625,7 @@
           <w:sz w:val="22"/>
           <w:szCs w:val="22"/>
         </w:rPr>
-        <w:t xml:space="preserve">The AC/DC converter’s task is to </w:t>
-      </w:r>
-      <w:r>
-        <w:rPr>
-          <w:rFonts w:asciiTheme="minorHAnsi" w:hAnsiTheme="minorHAnsi" w:cstheme="minorHAnsi"/>
-          <w:color w:val="1F2328"/>
-          <w:sz w:val="22"/>
-          <w:szCs w:val="22"/>
-        </w:rPr>
-        <w:t>convert AC power back into DC power when the electrical network requires DC power for various applications, such as charging batteries or powering DC devices.</w:t>
+        <w:t>The AC/DC converter’s task is to convert AC power back into DC power when the electrical network requires DC power for various applications, such as charging batteries or powering DC devices.</w:t>
       </w:r>
       <w:r>
         <w:rPr>
@@ -1721,16 +1700,7 @@
           <w:sz w:val="22"/>
           <w:szCs w:val="22"/>
         </w:rPr>
-        <w:t>In this tutorial, t</w:t>
-      </w:r>
-      <w:r>
-        <w:rPr>
-          <w:rFonts w:asciiTheme="minorHAnsi" w:hAnsiTheme="minorHAnsi" w:cstheme="minorHAnsi"/>
-          <w:color w:val="1F2328"/>
-          <w:sz w:val="22"/>
-          <w:szCs w:val="22"/>
-        </w:rPr>
-        <w:t>he DC/AC converter informs the AC/DC converter of the available power it can deliver. This information includes details like the power's magnitude and frequency.</w:t>
+        <w:t>In this tutorial, the DC/AC converter informs the AC/DC converter of the available power it can deliver. This information includes details like the power's magnitude and frequency.</w:t>
       </w:r>
     </w:p>
     <w:p>
@@ -1804,6 +1774,7 @@
       <w:r>
         <w:rPr>
           <w:rFonts w:asciiTheme="minorHAnsi" w:hAnsiTheme="minorHAnsi" w:cstheme="minorHAnsi"/>
+          <w:noProof/>
           <w:color w:val="1F2328"/>
           <w:sz w:val="22"/>
           <w:szCs w:val="22"/>
@@ -2023,16 +1994,7 @@
           <w:sz w:val="22"/>
           <w:szCs w:val="22"/>
         </w:rPr>
-        <w:t xml:space="preserve">Ethernet </w:t>
-      </w:r>
-      <w:r>
-        <w:rPr>
-          <w:rFonts w:asciiTheme="minorHAnsi" w:hAnsiTheme="minorHAnsi" w:cstheme="minorHAnsi"/>
-          <w:color w:val="1F2328"/>
-          <w:sz w:val="22"/>
-          <w:szCs w:val="22"/>
-        </w:rPr>
-        <w:t>cable</w:t>
+        <w:t>Ethernet cable</w:t>
       </w:r>
     </w:p>
     <w:p>
@@ -2208,6 +2170,7 @@
       <w:r>
         <w:rPr>
           <w:rFonts w:cstheme="minorHAnsi"/>
+          <w:noProof/>
           <w:color w:val="1F2328"/>
         </w:rPr>
         <w:drawing>
@@ -2341,6 +2304,7 @@
       <w:r>
         <w:rPr>
           <w:rFonts w:asciiTheme="minorHAnsi" w:hAnsiTheme="minorHAnsi" w:cstheme="minorHAnsi"/>
+          <w:noProof/>
           <w:color w:val="1F2328"/>
           <w:sz w:val="22"/>
           <w:szCs w:val="22"/>
@@ -4129,16 +4093,7 @@
           <w:sz w:val="22"/>
           <w:szCs w:val="22"/>
         </w:rPr>
-        <w:t>x_consigne</w:t>
-      </w:r>
-      <w:r>
-        <w:rPr>
-          <w:rFonts w:asciiTheme="minorHAnsi" w:hAnsiTheme="minorHAnsi" w:cstheme="minorHAnsi"/>
-          <w:color w:val="1F2328"/>
-          <w:sz w:val="22"/>
-          <w:szCs w:val="22"/>
-        </w:rPr>
-        <w:t>:</w:t>
+        <w:t>x_consigne:</w:t>
       </w:r>
       <w:r>
         <w:rPr>
@@ -4209,52 +4164,16 @@
           <w:sz w:val="22"/>
           <w:szCs w:val="22"/>
         </w:rPr>
-        <w:t>buffer_</w:t>
-      </w:r>
-      <w:r>
-        <w:rPr>
-          <w:rFonts w:asciiTheme="minorHAnsi" w:hAnsiTheme="minorHAnsi" w:cstheme="minorHAnsi"/>
-          <w:color w:val="1F2328"/>
-          <w:sz w:val="22"/>
-          <w:szCs w:val="22"/>
-        </w:rPr>
-        <w:t>r</w:t>
-      </w:r>
-      <w:r>
-        <w:rPr>
-          <w:rFonts w:asciiTheme="minorHAnsi" w:hAnsiTheme="minorHAnsi" w:cstheme="minorHAnsi"/>
-          <w:color w:val="1F2328"/>
-          <w:sz w:val="22"/>
-          <w:szCs w:val="22"/>
-        </w:rPr>
-        <w:t>x</w:t>
-      </w:r>
-      <w:r>
-        <w:rPr>
-          <w:rFonts w:asciiTheme="minorHAnsi" w:hAnsiTheme="minorHAnsi" w:cstheme="minorHAnsi"/>
-          <w:color w:val="1F2328"/>
-          <w:sz w:val="22"/>
-          <w:szCs w:val="22"/>
-        </w:rPr>
-        <w:t>:</w:t>
-      </w:r>
-      <w:r>
-        <w:rPr>
-          <w:rFonts w:asciiTheme="minorHAnsi" w:hAnsiTheme="minorHAnsi" w:cstheme="minorHAnsi"/>
-          <w:color w:val="1F2328"/>
-          <w:sz w:val="22"/>
-          <w:szCs w:val="22"/>
-        </w:rPr>
-        <w:t xml:space="preserve"> </w:t>
-      </w:r>
-      <w:r>
-        <w:rPr>
-          <w:rFonts w:asciiTheme="minorHAnsi" w:hAnsiTheme="minorHAnsi" w:cstheme="minorHAnsi"/>
-          <w:color w:val="1F2328"/>
-          <w:sz w:val="22"/>
-          <w:szCs w:val="22"/>
-        </w:rPr>
-        <w:t>Pointer to the transmitted buffer</w:t>
+        <w:t>buffer_rx:</w:t>
+      </w:r>
+      <w:r>
+        <w:rPr>
+          <w:rFonts w:asciiTheme="minorHAnsi" w:hAnsiTheme="minorHAnsi" w:cstheme="minorHAnsi"/>
+          <w:color w:val="1F2328"/>
+          <w:sz w:val="22"/>
+          <w:szCs w:val="22"/>
+        </w:rPr>
+        <w:t xml:space="preserve"> Pointer to the transmitted buffer</w:t>
       </w:r>
       <w:r>
         <w:rPr>
@@ -5039,25 +4958,7 @@
           <w:sz w:val="22"/>
           <w:szCs w:val="22"/>
         </w:rPr>
-        <w:t>The d</w:t>
-      </w:r>
-      <w:r>
-        <w:rPr>
-          <w:rFonts w:asciiTheme="minorHAnsi" w:hAnsiTheme="minorHAnsi" w:cstheme="minorHAnsi"/>
-          <w:color w:val="1F2328"/>
-          <w:sz w:val="22"/>
-          <w:szCs w:val="22"/>
-        </w:rPr>
-        <w:t>ump_scope_datas</w:t>
-      </w:r>
-      <w:r>
-        <w:rPr>
-          <w:rFonts w:asciiTheme="minorHAnsi" w:hAnsiTheme="minorHAnsi" w:cstheme="minorHAnsi"/>
-          <w:color w:val="1F2328"/>
-          <w:sz w:val="22"/>
-          <w:szCs w:val="22"/>
-        </w:rPr>
-        <w:t xml:space="preserve"> function</w:t>
+        <w:t>The dump_scope_datas function</w:t>
       </w:r>
       <w:r>
         <w:rPr>
@@ -6619,62 +6520,145 @@
           <w:sz w:val="22"/>
           <w:szCs w:val="22"/>
         </w:rPr>
-        <w:t>. If yes, the status flag is updated and the scope starts to acquire data if the receiver id</w:t>
-      </w:r>
-      <w:r>
-        <w:rPr>
-          <w:rFonts w:asciiTheme="minorHAnsi" w:hAnsiTheme="minorHAnsi" w:cstheme="minorHAnsi"/>
-          <w:color w:val="1F2328"/>
-          <w:sz w:val="22"/>
-          <w:szCs w:val="22"/>
-        </w:rPr>
-        <w:t>_status is 00100010 (</w:t>
-      </w:r>
-      <w:r>
-        <w:rPr>
-          <w:rFonts w:asciiTheme="minorHAnsi" w:hAnsiTheme="minorHAnsi" w:cstheme="minorHAnsi"/>
-          <w:color w:val="1F2328"/>
-          <w:sz w:val="22"/>
-          <w:szCs w:val="22"/>
-        </w:rPr>
-        <w:t>2</w:t>
-      </w:r>
-      <w:r>
-        <w:rPr>
-          <w:rFonts w:asciiTheme="minorHAnsi" w:hAnsiTheme="minorHAnsi" w:cstheme="minorHAnsi"/>
-          <w:color w:val="1F2328"/>
-          <w:sz w:val="22"/>
-          <w:szCs w:val="22"/>
-          <w:vertAlign w:val="superscript"/>
-        </w:rPr>
-        <w:t>nd</w:t>
-      </w:r>
-      <w:r>
-        <w:rPr>
-          <w:rFonts w:asciiTheme="minorHAnsi" w:hAnsiTheme="minorHAnsi" w:cstheme="minorHAnsi"/>
-          <w:color w:val="1F2328"/>
-          <w:sz w:val="22"/>
-          <w:szCs w:val="22"/>
-        </w:rPr>
-        <w:t xml:space="preserve"> bit is 1</w:t>
-      </w:r>
-      <w:r>
-        <w:rPr>
-          <w:rFonts w:asciiTheme="minorHAnsi" w:hAnsiTheme="minorHAnsi" w:cstheme="minorHAnsi"/>
-          <w:color w:val="1F2328"/>
-          <w:sz w:val="22"/>
-          <w:szCs w:val="22"/>
+        <w:t>.</w:t>
+      </w:r>
+    </w:p>
+    <w:p>
+      <w:pPr>
+        <w:shd w:val="clear" w:color="auto" w:fill="1F1F1F"/>
+        <w:spacing w:line="285" w:lineRule="atLeast"/>
+        <w:rPr>
+          <w:rFonts w:ascii="Consolas" w:hAnsi="Consolas"/>
+          <w:color w:val="CCCCCC"/>
+          <w:sz w:val="21"/>
+          <w:szCs w:val="21"/>
+        </w:rPr>
+      </w:pPr>
+      <w:r>
+        <w:rPr>
+          <w:rFonts w:ascii="Consolas" w:hAnsi="Consolas"/>
+          <w:color w:val="C586C0"/>
+          <w:sz w:val="21"/>
+          <w:szCs w:val="21"/>
+        </w:rPr>
+        <w:t>if</w:t>
+      </w:r>
+      <w:r>
+        <w:rPr>
+          <w:rFonts w:ascii="Consolas" w:hAnsi="Consolas"/>
+          <w:color w:val="CCCCCC"/>
+          <w:sz w:val="21"/>
+          <w:szCs w:val="21"/>
+        </w:rPr>
+        <w:t xml:space="preserve"> (</w:t>
+      </w:r>
+      <w:r>
+        <w:rPr>
+          <w:rFonts w:ascii="Consolas" w:hAnsi="Consolas"/>
+          <w:color w:val="9CDCFE"/>
+          <w:sz w:val="21"/>
+          <w:szCs w:val="21"/>
+        </w:rPr>
+        <w:t>rx_consigne</w:t>
+      </w:r>
+      <w:r>
+        <w:rPr>
+          <w:rFonts w:ascii="Consolas" w:hAnsi="Consolas"/>
+          <w:color w:val="CCCCCC"/>
+          <w:sz w:val="21"/>
+          <w:szCs w:val="21"/>
+        </w:rPr>
+        <w:t>.</w:t>
+      </w:r>
+      <w:r>
+        <w:rPr>
+          <w:rFonts w:ascii="Consolas" w:hAnsi="Consolas"/>
+          <w:color w:val="9CDCFE"/>
+          <w:sz w:val="21"/>
+          <w:szCs w:val="21"/>
+        </w:rPr>
+        <w:t>id_and_status</w:t>
+      </w:r>
+      <w:r>
+        <w:rPr>
+          <w:rFonts w:ascii="Consolas" w:hAnsi="Consolas"/>
+          <w:color w:val="CCCCCC"/>
+          <w:sz w:val="21"/>
+          <w:szCs w:val="21"/>
+        </w:rPr>
+        <w:t xml:space="preserve"> </w:t>
+      </w:r>
+      <w:r>
+        <w:rPr>
+          <w:rFonts w:ascii="Consolas" w:hAnsi="Consolas"/>
+          <w:color w:val="D4D4D4"/>
+          <w:sz w:val="21"/>
+          <w:szCs w:val="21"/>
+        </w:rPr>
+        <w:t>&gt;&gt;</w:t>
+      </w:r>
+      <w:r>
+        <w:rPr>
+          <w:rFonts w:ascii="Consolas" w:hAnsi="Consolas"/>
+          <w:color w:val="CCCCCC"/>
+          <w:sz w:val="21"/>
+          <w:szCs w:val="21"/>
+        </w:rPr>
+        <w:t xml:space="preserve"> </w:t>
+      </w:r>
+      <w:r>
+        <w:rPr>
+          <w:rFonts w:ascii="Consolas" w:hAnsi="Consolas"/>
+          <w:color w:val="B5CEA8"/>
+          <w:sz w:val="21"/>
+          <w:szCs w:val="21"/>
+        </w:rPr>
+        <w:t>6</w:t>
+      </w:r>
+      <w:r>
+        <w:rPr>
+          <w:rFonts w:ascii="Consolas" w:hAnsi="Consolas"/>
+          <w:color w:val="CCCCCC"/>
+          <w:sz w:val="21"/>
+          <w:szCs w:val="21"/>
+        </w:rPr>
+        <w:t xml:space="preserve"> </w:t>
+      </w:r>
+      <w:r>
+        <w:rPr>
+          <w:rFonts w:ascii="Consolas" w:hAnsi="Consolas"/>
+          <w:color w:val="D4D4D4"/>
+          <w:sz w:val="21"/>
+          <w:szCs w:val="21"/>
+        </w:rPr>
+        <w:t>==</w:t>
+      </w:r>
+      <w:r>
+        <w:rPr>
+          <w:rFonts w:ascii="Consolas" w:hAnsi="Consolas"/>
+          <w:color w:val="CCCCCC"/>
+          <w:sz w:val="21"/>
+          <w:szCs w:val="21"/>
+        </w:rPr>
+        <w:t xml:space="preserve"> </w:t>
+      </w:r>
+      <w:r>
+        <w:rPr>
+          <w:rFonts w:ascii="Consolas" w:hAnsi="Consolas"/>
+          <w:color w:val="B5CEA8"/>
+          <w:sz w:val="21"/>
+          <w:szCs w:val="21"/>
+        </w:rPr>
+        <w:t>1</w:t>
+      </w:r>
+      <w:r>
+        <w:rPr>
+          <w:rFonts w:ascii="Consolas" w:hAnsi="Consolas"/>
+          <w:color w:val="CCCCCC"/>
+          <w:sz w:val="21"/>
+          <w:szCs w:val="21"/>
         </w:rPr>
         <w:t>)</w:t>
-      </w:r>
-      <w:r>
-        <w:rPr>
-          <w:rFonts w:asciiTheme="minorHAnsi" w:hAnsiTheme="minorHAnsi" w:cstheme="minorHAnsi"/>
-          <w:color w:val="1F2328"/>
-          <w:sz w:val="22"/>
-          <w:szCs w:val="22"/>
-        </w:rPr>
-        <w:t>. The P_ref value is also set to the value sent by the SERVER converter.</w:t>
       </w:r>
     </w:p>
     <w:p>
@@ -6689,6 +6673,208 @@
           <w:szCs w:val="22"/>
         </w:rPr>
       </w:pPr>
+      <w:r>
+        <w:rPr>
+          <w:rFonts w:asciiTheme="minorHAnsi" w:hAnsiTheme="minorHAnsi" w:cstheme="minorHAnsi"/>
+          <w:color w:val="1F2328"/>
+          <w:sz w:val="22"/>
+          <w:szCs w:val="22"/>
+        </w:rPr>
+        <w:t>If yes, the status flag is updated and the scope starts to acquire data if the receiver id</w:t>
+      </w:r>
+      <w:r>
+        <w:rPr>
+          <w:rFonts w:asciiTheme="minorHAnsi" w:hAnsiTheme="minorHAnsi" w:cstheme="minorHAnsi"/>
+          <w:color w:val="1F2328"/>
+          <w:sz w:val="22"/>
+          <w:szCs w:val="22"/>
+        </w:rPr>
+        <w:t>_status is 00100010 (</w:t>
+      </w:r>
+      <w:r>
+        <w:rPr>
+          <w:rFonts w:asciiTheme="minorHAnsi" w:hAnsiTheme="minorHAnsi" w:cstheme="minorHAnsi"/>
+          <w:color w:val="1F2328"/>
+          <w:sz w:val="22"/>
+          <w:szCs w:val="22"/>
+        </w:rPr>
+        <w:t>2</w:t>
+      </w:r>
+      <w:r>
+        <w:rPr>
+          <w:rFonts w:asciiTheme="minorHAnsi" w:hAnsiTheme="minorHAnsi" w:cstheme="minorHAnsi"/>
+          <w:color w:val="1F2328"/>
+          <w:sz w:val="22"/>
+          <w:szCs w:val="22"/>
+          <w:vertAlign w:val="superscript"/>
+        </w:rPr>
+        <w:t>nd</w:t>
+      </w:r>
+      <w:r>
+        <w:rPr>
+          <w:rFonts w:asciiTheme="minorHAnsi" w:hAnsiTheme="minorHAnsi" w:cstheme="minorHAnsi"/>
+          <w:color w:val="1F2328"/>
+          <w:sz w:val="22"/>
+          <w:szCs w:val="22"/>
+        </w:rPr>
+        <w:t xml:space="preserve"> bit is 1</w:t>
+      </w:r>
+      <w:r>
+        <w:rPr>
+          <w:rFonts w:asciiTheme="minorHAnsi" w:hAnsiTheme="minorHAnsi" w:cstheme="minorHAnsi"/>
+          <w:color w:val="1F2328"/>
+          <w:sz w:val="22"/>
+          <w:szCs w:val="22"/>
+        </w:rPr>
+        <w:t>)</w:t>
+      </w:r>
+      <w:r>
+        <w:rPr>
+          <w:rFonts w:asciiTheme="minorHAnsi" w:hAnsiTheme="minorHAnsi" w:cstheme="minorHAnsi"/>
+          <w:color w:val="1F2328"/>
+          <w:sz w:val="22"/>
+          <w:szCs w:val="22"/>
+        </w:rPr>
+        <w:t>.</w:t>
+      </w:r>
+    </w:p>
+    <w:p>
+      <w:pPr>
+        <w:shd w:val="clear" w:color="auto" w:fill="1F1F1F"/>
+        <w:spacing w:line="285" w:lineRule="atLeast"/>
+        <w:rPr>
+          <w:rFonts w:ascii="Consolas" w:hAnsi="Consolas"/>
+          <w:color w:val="CCCCCC"/>
+          <w:sz w:val="21"/>
+          <w:szCs w:val="21"/>
+        </w:rPr>
+      </w:pPr>
+      <w:r>
+        <w:rPr>
+          <w:rFonts w:ascii="Consolas" w:hAnsi="Consolas"/>
+          <w:color w:val="C586C0"/>
+          <w:sz w:val="21"/>
+          <w:szCs w:val="21"/>
+        </w:rPr>
+        <w:t>if</w:t>
+      </w:r>
+      <w:r>
+        <w:rPr>
+          <w:rFonts w:ascii="Consolas" w:hAnsi="Consolas"/>
+          <w:color w:val="CCCCCC"/>
+          <w:sz w:val="21"/>
+          <w:szCs w:val="21"/>
+        </w:rPr>
+        <w:t xml:space="preserve"> ((</w:t>
+      </w:r>
+      <w:r>
+        <w:rPr>
+          <w:rFonts w:ascii="Consolas" w:hAnsi="Consolas"/>
+          <w:color w:val="9CDCFE"/>
+          <w:sz w:val="21"/>
+          <w:szCs w:val="21"/>
+        </w:rPr>
+        <w:t>rx_consigne</w:t>
+      </w:r>
+      <w:r>
+        <w:rPr>
+          <w:rFonts w:ascii="Consolas" w:hAnsi="Consolas"/>
+          <w:color w:val="CCCCCC"/>
+          <w:sz w:val="21"/>
+          <w:szCs w:val="21"/>
+        </w:rPr>
+        <w:t>.</w:t>
+      </w:r>
+      <w:r>
+        <w:rPr>
+          <w:rFonts w:ascii="Consolas" w:hAnsi="Consolas"/>
+          <w:color w:val="9CDCFE"/>
+          <w:sz w:val="21"/>
+          <w:szCs w:val="21"/>
+        </w:rPr>
+        <w:t>id_and_status</w:t>
+      </w:r>
+      <w:r>
+        <w:rPr>
+          <w:rFonts w:ascii="Consolas" w:hAnsi="Consolas"/>
+          <w:color w:val="CCCCCC"/>
+          <w:sz w:val="21"/>
+          <w:szCs w:val="21"/>
+        </w:rPr>
+        <w:t xml:space="preserve"> </w:t>
+      </w:r>
+      <w:r>
+        <w:rPr>
+          <w:rFonts w:ascii="Consolas" w:hAnsi="Consolas"/>
+          <w:color w:val="D4D4D4"/>
+          <w:sz w:val="21"/>
+          <w:szCs w:val="21"/>
+        </w:rPr>
+        <w:t>&amp;</w:t>
+      </w:r>
+      <w:r>
+        <w:rPr>
+          <w:rFonts w:ascii="Consolas" w:hAnsi="Consolas"/>
+          <w:color w:val="CCCCCC"/>
+          <w:sz w:val="21"/>
+          <w:szCs w:val="21"/>
+        </w:rPr>
+        <w:t xml:space="preserve"> </w:t>
+      </w:r>
+      <w:r>
+        <w:rPr>
+          <w:rFonts w:ascii="Consolas" w:hAnsi="Consolas"/>
+          <w:color w:val="B5CEA8"/>
+          <w:sz w:val="21"/>
+          <w:szCs w:val="21"/>
+        </w:rPr>
+        <w:t>2</w:t>
+      </w:r>
+      <w:r>
+        <w:rPr>
+          <w:rFonts w:ascii="Consolas" w:hAnsi="Consolas"/>
+          <w:color w:val="CCCCCC"/>
+          <w:sz w:val="21"/>
+          <w:szCs w:val="21"/>
+        </w:rPr>
+        <w:t xml:space="preserve">) </w:t>
+      </w:r>
+      <w:r>
+        <w:rPr>
+          <w:rFonts w:ascii="Consolas" w:hAnsi="Consolas"/>
+          <w:color w:val="D4D4D4"/>
+          <w:sz w:val="21"/>
+          <w:szCs w:val="21"/>
+        </w:rPr>
+        <w:t>==</w:t>
+      </w:r>
+      <w:r>
+        <w:rPr>
+          <w:rFonts w:ascii="Consolas" w:hAnsi="Consolas"/>
+          <w:color w:val="CCCCCC"/>
+          <w:sz w:val="21"/>
+          <w:szCs w:val="21"/>
+        </w:rPr>
+        <w:t xml:space="preserve"> </w:t>
+      </w:r>
+      <w:r>
+        <w:rPr>
+          <w:rFonts w:ascii="Consolas" w:hAnsi="Consolas"/>
+          <w:color w:val="B5CEA8"/>
+          <w:sz w:val="21"/>
+          <w:szCs w:val="21"/>
+        </w:rPr>
+        <w:t>1</w:t>
+      </w:r>
+      <w:r>
+        <w:rPr>
+          <w:rFonts w:ascii="Consolas" w:hAnsi="Consolas"/>
+          <w:color w:val="CCCCCC"/>
+          <w:sz w:val="21"/>
+          <w:szCs w:val="21"/>
+        </w:rPr>
+        <w:t>)</w:t>
+      </w:r>
     </w:p>
     <w:p>
       <w:pPr>
@@ -6718,7 +6904,16 @@
           <w:sz w:val="22"/>
           <w:szCs w:val="22"/>
         </w:rPr>
-        <w:t>rx_consigne.id_and_status</w:t>
+        <w:t>id_and_status</w:t>
+      </w:r>
+      <w:r>
+        <w:rPr>
+          <w:rFonts w:asciiTheme="minorHAnsi" w:hAnsiTheme="minorHAnsi" w:cstheme="minorHAnsi"/>
+          <w:color w:val="1F2328"/>
+          <w:sz w:val="22"/>
+          <w:szCs w:val="22"/>
+        </w:rPr>
+        <w:t xml:space="preserve"> for the CLIENT</w:t>
       </w:r>
       <w:r>
         <w:rPr>
@@ -6753,34 +6948,7 @@
           <w:sz w:val="22"/>
           <w:szCs w:val="22"/>
         </w:rPr>
-        <w:t>001000</w:t>
-      </w:r>
-      <w:r>
-        <w:rPr>
-          <w:rFonts w:asciiTheme="minorHAnsi" w:hAnsiTheme="minorHAnsi" w:cstheme="minorHAnsi"/>
-          <w:color w:val="1F2328"/>
-          <w:sz w:val="22"/>
-          <w:szCs w:val="22"/>
-        </w:rPr>
-        <w:t>0</w:t>
-      </w:r>
-      <w:r>
-        <w:rPr>
-          <w:rFonts w:asciiTheme="minorHAnsi" w:hAnsiTheme="minorHAnsi" w:cstheme="minorHAnsi"/>
-          <w:color w:val="1F2328"/>
-          <w:sz w:val="22"/>
-          <w:szCs w:val="22"/>
-        </w:rPr>
-        <w:t>0</w:t>
-      </w:r>
-      <w:r>
-        <w:rPr>
-          <w:rFonts w:asciiTheme="minorHAnsi" w:hAnsiTheme="minorHAnsi" w:cstheme="minorHAnsi"/>
-          <w:color w:val="1F2328"/>
-          <w:sz w:val="22"/>
-          <w:szCs w:val="22"/>
-        </w:rPr>
-        <w:t xml:space="preserve"> identifies the intended receiver board to communicate these informations</w:t>
+        <w:t>00100000 identifies the intended receiver board to communicate these informations</w:t>
       </w:r>
     </w:p>
     <w:p>
@@ -6806,34 +6974,29 @@
           <w:sz w:val="22"/>
           <w:szCs w:val="22"/>
         </w:rPr>
-        <w:t>001000</w:t>
-      </w:r>
-      <w:r>
-        <w:rPr>
-          <w:rFonts w:asciiTheme="minorHAnsi" w:hAnsiTheme="minorHAnsi" w:cstheme="minorHAnsi"/>
-          <w:color w:val="1F2328"/>
-          <w:sz w:val="22"/>
-          <w:szCs w:val="22"/>
-        </w:rPr>
-        <w:t>1</w:t>
-      </w:r>
-      <w:r>
-        <w:rPr>
-          <w:rFonts w:asciiTheme="minorHAnsi" w:hAnsiTheme="minorHAnsi" w:cstheme="minorHAnsi"/>
-          <w:color w:val="1F2328"/>
-          <w:sz w:val="22"/>
-          <w:szCs w:val="22"/>
-        </w:rPr>
-        <w:t>0</w:t>
-      </w:r>
-      <w:r>
-        <w:rPr>
-          <w:rFonts w:asciiTheme="minorHAnsi" w:hAnsiTheme="minorHAnsi" w:cstheme="minorHAnsi"/>
-          <w:color w:val="1F2328"/>
-          <w:sz w:val="22"/>
-          <w:szCs w:val="22"/>
-        </w:rPr>
-        <w:t xml:space="preserve"> the same and also states that the scope function can be started.</w:t>
+        <w:t>00100010 the same and also states that the scope function can be started.</w:t>
+      </w:r>
+    </w:p>
+    <w:p>
+      <w:pPr>
+        <w:shd w:val="clear" w:color="auto" w:fill="FFFFFF"/>
+        <w:spacing w:before="100" w:beforeAutospacing="1" w:after="100" w:afterAutospacing="1"/>
+        <w:ind w:firstLine="708"/>
+        <w:rPr>
+          <w:rFonts w:asciiTheme="minorHAnsi" w:hAnsiTheme="minorHAnsi" w:cstheme="minorHAnsi"/>
+          <w:color w:val="1F2328"/>
+          <w:sz w:val="22"/>
+          <w:szCs w:val="22"/>
+        </w:rPr>
+      </w:pPr>
+      <w:r>
+        <w:rPr>
+          <w:rFonts w:asciiTheme="minorHAnsi" w:hAnsiTheme="minorHAnsi" w:cstheme="minorHAnsi"/>
+          <w:color w:val="1F2328"/>
+          <w:sz w:val="22"/>
+          <w:szCs w:val="22"/>
+        </w:rPr>
+        <w:t>The P_ref value is also set to the value sent by the SERVER converter.</w:t>
       </w:r>
     </w:p>
     <w:p>
@@ -7387,6 +7550,7 @@
           <w:sz w:val="21"/>
           <w:szCs w:val="21"/>
         </w:rPr>
+        <w:lastRenderedPageBreak/>
         <w:t xml:space="preserve">            </w:t>
       </w:r>
       <w:r>
@@ -7824,34 +7988,7 @@
           <w:sz w:val="22"/>
           <w:szCs w:val="22"/>
         </w:rPr>
-        <w:t>twist.initLegBuck(LEG1)</w:t>
-      </w:r>
-      <w:r>
-        <w:rPr>
-          <w:rFonts w:asciiTheme="minorHAnsi" w:hAnsiTheme="minorHAnsi" w:cstheme="minorHAnsi"/>
-          <w:color w:val="1F2328"/>
-          <w:sz w:val="22"/>
-          <w:szCs w:val="22"/>
-        </w:rPr>
-        <w:t xml:space="preserve"> and </w:t>
-      </w:r>
-      <w:r>
-        <w:rPr>
-          <w:rFonts w:asciiTheme="minorHAnsi" w:hAnsiTheme="minorHAnsi" w:cstheme="minorHAnsi"/>
-          <w:color w:val="1F2328"/>
-          <w:sz w:val="22"/>
-          <w:szCs w:val="22"/>
-        </w:rPr>
-        <w:t>twist.initLegBoost(LEG2)</w:t>
-      </w:r>
-      <w:r>
-        <w:rPr>
-          <w:rFonts w:asciiTheme="minorHAnsi" w:hAnsiTheme="minorHAnsi" w:cstheme="minorHAnsi"/>
-          <w:color w:val="1F2328"/>
-          <w:sz w:val="22"/>
-          <w:szCs w:val="22"/>
-        </w:rPr>
-        <w:t>:</w:t>
+        <w:t>twist.initLegBuck(LEG1) and twist.initLegBoost(LEG2):</w:t>
       </w:r>
       <w:r>
         <w:rPr>
@@ -7977,16 +8114,7 @@
           <w:sz w:val="22"/>
           <w:szCs w:val="22"/>
         </w:rPr>
-        <w:t>communication.rs485.configure(...)</w:t>
-      </w:r>
-      <w:r>
-        <w:rPr>
-          <w:rFonts w:asciiTheme="minorHAnsi" w:hAnsiTheme="minorHAnsi" w:cstheme="minorHAnsi"/>
-          <w:color w:val="1F2328"/>
-          <w:sz w:val="22"/>
-          <w:szCs w:val="22"/>
-        </w:rPr>
-        <w:t>: configures the communication between th</w:t>
+        <w:t>communication.rs485.configure(...): configures the communication between th</w:t>
       </w:r>
       <w:r>
         <w:rPr>
@@ -8472,6 +8600,19 @@
     <w:p>
       <w:pPr>
         <w:pStyle w:val="Paragraphedeliste"/>
+        <w:shd w:val="clear" w:color="auto" w:fill="FFFFFF"/>
+        <w:spacing w:beforeAutospacing="1" w:afterAutospacing="1"/>
+        <w:rPr>
+          <w:rFonts w:asciiTheme="minorHAnsi" w:hAnsiTheme="minorHAnsi" w:cstheme="minorHAnsi"/>
+          <w:color w:val="1F2328"/>
+          <w:sz w:val="22"/>
+          <w:szCs w:val="22"/>
+        </w:rPr>
+      </w:pPr>
+    </w:p>
+    <w:p>
+      <w:pPr>
+        <w:pStyle w:val="Paragraphedeliste"/>
         <w:numPr>
           <w:ilvl w:val="0"/>
           <w:numId w:val="30"/>
@@ -8492,16 +8633,8 @@
           <w:sz w:val="22"/>
           <w:szCs w:val="22"/>
         </w:rPr>
-        <w:t xml:space="preserve">Loop functions and </w:t>
-      </w:r>
-      <w:r>
-        <w:rPr>
-          <w:rFonts w:asciiTheme="minorHAnsi" w:hAnsiTheme="minorHAnsi" w:cstheme="minorHAnsi"/>
-          <w:color w:val="1F2328"/>
-          <w:sz w:val="22"/>
-          <w:szCs w:val="22"/>
-        </w:rPr>
-        <w:t>Closed-loop buck implementation</w:t>
+        <w:lastRenderedPageBreak/>
+        <w:t>Loop functions</w:t>
       </w:r>
     </w:p>
     <w:p>
@@ -8697,7 +8830,6 @@
           <w:sz w:val="22"/>
           <w:szCs w:val="22"/>
         </w:rPr>
-        <w:lastRenderedPageBreak/>
         <w:t>In the application task:</w:t>
       </w:r>
     </w:p>
@@ -8998,16 +9130,66 @@
           <w:sz w:val="22"/>
           <w:szCs w:val="22"/>
         </w:rPr>
-        <w:t xml:space="preserve">, </w:t>
-      </w:r>
-      <w:r>
-        <w:rPr>
-          <w:rFonts w:asciiTheme="minorHAnsi" w:hAnsiTheme="minorHAnsi" w:cstheme="minorHAnsi"/>
-          <w:color w:val="1F2328"/>
-          <w:sz w:val="22"/>
-          <w:szCs w:val="22"/>
-        </w:rPr>
-        <w:t>the pwm is enabled and there is power conversion. T</w:t>
+        <w:t>:</w:t>
+      </w:r>
+    </w:p>
+    <w:p>
+      <w:pPr>
+        <w:numPr>
+          <w:ilvl w:val="1"/>
+          <w:numId w:val="29"/>
+        </w:numPr>
+        <w:shd w:val="clear" w:color="auto" w:fill="FFFFFF"/>
+        <w:spacing w:beforeAutospacing="1" w:afterAutospacing="1"/>
+        <w:rPr>
+          <w:rFonts w:asciiTheme="minorHAnsi" w:hAnsiTheme="minorHAnsi" w:cstheme="minorHAnsi"/>
+          <w:color w:val="1F2328"/>
+          <w:sz w:val="22"/>
+          <w:szCs w:val="22"/>
+        </w:rPr>
+      </w:pPr>
+      <w:r>
+        <w:rPr>
+          <w:rFonts w:asciiTheme="minorHAnsi" w:hAnsiTheme="minorHAnsi" w:cstheme="minorHAnsi"/>
+          <w:color w:val="1F2328"/>
+          <w:sz w:val="22"/>
+          <w:szCs w:val="22"/>
+        </w:rPr>
+        <w:t>T</w:t>
+      </w:r>
+      <w:r>
+        <w:rPr>
+          <w:rFonts w:asciiTheme="minorHAnsi" w:hAnsiTheme="minorHAnsi" w:cstheme="minorHAnsi"/>
+          <w:color w:val="1F2328"/>
+          <w:sz w:val="22"/>
+          <w:szCs w:val="22"/>
+        </w:rPr>
+        <w:t>he pwm is enabled and there is power conversion.</w:t>
+      </w:r>
+    </w:p>
+    <w:p>
+      <w:pPr>
+        <w:numPr>
+          <w:ilvl w:val="1"/>
+          <w:numId w:val="29"/>
+        </w:numPr>
+        <w:shd w:val="clear" w:color="auto" w:fill="FFFFFF"/>
+        <w:spacing w:beforeAutospacing="1" w:afterAutospacing="1"/>
+        <w:rPr>
+          <w:rFonts w:asciiTheme="minorHAnsi" w:hAnsiTheme="minorHAnsi" w:cstheme="minorHAnsi"/>
+          <w:color w:val="1F2328"/>
+          <w:sz w:val="22"/>
+          <w:szCs w:val="22"/>
+        </w:rPr>
+      </w:pPr>
+      <w:r>
+        <w:rPr>
+          <w:rFonts w:asciiTheme="minorHAnsi" w:hAnsiTheme="minorHAnsi" w:cstheme="minorHAnsi"/>
+          <w:color w:val="1F2328"/>
+          <w:sz w:val="22"/>
+          <w:szCs w:val="22"/>
+        </w:rPr>
+        <w:t>T</w:t>
       </w:r>
       <w:r>
         <w:rPr>
@@ -9025,7 +9207,32 @@
           <w:sz w:val="22"/>
           <w:szCs w:val="22"/>
         </w:rPr>
-        <w:t>using a sinus with Vac_ref amplitude. The id_status is updated according to th</w:t>
+        <w:t>using a sinus with Vac_ref amplitude.</w:t>
+      </w:r>
+    </w:p>
+    <w:p>
+      <w:pPr>
+        <w:numPr>
+          <w:ilvl w:val="1"/>
+          <w:numId w:val="29"/>
+        </w:numPr>
+        <w:shd w:val="clear" w:color="auto" w:fill="FFFFFF"/>
+        <w:spacing w:beforeAutospacing="1" w:afterAutospacing="1"/>
+        <w:rPr>
+          <w:rFonts w:asciiTheme="minorHAnsi" w:hAnsiTheme="minorHAnsi" w:cstheme="minorHAnsi"/>
+          <w:color w:val="1F2328"/>
+          <w:sz w:val="22"/>
+          <w:szCs w:val="22"/>
+        </w:rPr>
+      </w:pPr>
+      <w:r>
+        <w:rPr>
+          <w:rFonts w:asciiTheme="minorHAnsi" w:hAnsiTheme="minorHAnsi" w:cstheme="minorHAnsi"/>
+          <w:color w:val="1F2328"/>
+          <w:sz w:val="22"/>
+          <w:szCs w:val="22"/>
+        </w:rPr>
+        <w:t>The id_status is updated according to th</w:t>
       </w:r>
       <w:r>
         <w:rPr>
@@ -9052,16 +9259,66 @@
           <w:sz w:val="22"/>
           <w:szCs w:val="22"/>
         </w:rPr>
-        <w:t xml:space="preserve"> and P_ref to be sent is also updated. The communication transmission is started and during </w:t>
-      </w:r>
-      <w:r>
-        <w:rPr>
-          <w:rFonts w:asciiTheme="minorHAnsi" w:hAnsiTheme="minorHAnsi" w:cstheme="minorHAnsi"/>
-          <w:color w:val="1F2328"/>
-          <w:sz w:val="22"/>
-          <w:szCs w:val="22"/>
-        </w:rPr>
-        <w:t>the whole time in POWERMODE, the scope acquires the measured data.</w:t>
+        <w:t xml:space="preserve"> and P_ref to be sent is also updated. </w:t>
+      </w:r>
+    </w:p>
+    <w:p>
+      <w:pPr>
+        <w:numPr>
+          <w:ilvl w:val="1"/>
+          <w:numId w:val="29"/>
+        </w:numPr>
+        <w:shd w:val="clear" w:color="auto" w:fill="FFFFFF"/>
+        <w:spacing w:beforeAutospacing="1" w:afterAutospacing="1"/>
+        <w:rPr>
+          <w:rFonts w:asciiTheme="minorHAnsi" w:hAnsiTheme="minorHAnsi" w:cstheme="minorHAnsi"/>
+          <w:color w:val="1F2328"/>
+          <w:sz w:val="22"/>
+          <w:szCs w:val="22"/>
+        </w:rPr>
+      </w:pPr>
+      <w:r>
+        <w:rPr>
+          <w:rFonts w:asciiTheme="minorHAnsi" w:hAnsiTheme="minorHAnsi" w:cstheme="minorHAnsi"/>
+          <w:color w:val="1F2328"/>
+          <w:sz w:val="22"/>
+          <w:szCs w:val="22"/>
+        </w:rPr>
+        <w:t>The communication transmission is started</w:t>
+      </w:r>
+    </w:p>
+    <w:p>
+      <w:pPr>
+        <w:numPr>
+          <w:ilvl w:val="1"/>
+          <w:numId w:val="29"/>
+        </w:numPr>
+        <w:shd w:val="clear" w:color="auto" w:fill="FFFFFF"/>
+        <w:spacing w:beforeAutospacing="1" w:afterAutospacing="1"/>
+        <w:rPr>
+          <w:rFonts w:asciiTheme="minorHAnsi" w:hAnsiTheme="minorHAnsi" w:cstheme="minorHAnsi"/>
+          <w:color w:val="1F2328"/>
+          <w:sz w:val="22"/>
+          <w:szCs w:val="22"/>
+        </w:rPr>
+      </w:pPr>
+      <w:r>
+        <w:rPr>
+          <w:rFonts w:asciiTheme="minorHAnsi" w:hAnsiTheme="minorHAnsi" w:cstheme="minorHAnsi"/>
+          <w:color w:val="1F2328"/>
+          <w:sz w:val="22"/>
+          <w:szCs w:val="22"/>
+        </w:rPr>
+        <w:t>At every critical task cycle</w:t>
+      </w:r>
+      <w:r>
+        <w:rPr>
+          <w:rFonts w:asciiTheme="minorHAnsi" w:hAnsiTheme="minorHAnsi" w:cstheme="minorHAnsi"/>
+          <w:color w:val="1F2328"/>
+          <w:sz w:val="22"/>
+          <w:szCs w:val="22"/>
+        </w:rPr>
+        <w:t>, the scope acquires the measured data.</w:t>
       </w:r>
     </w:p>
     <w:p>
@@ -9086,7 +9343,16 @@
           <w:sz w:val="22"/>
           <w:szCs w:val="22"/>
         </w:rPr>
-        <w:t>The CLIENT board derives from the id_status if it should be in POWERMODE or in IDLEMODE. It is in POWERMODE if the last three bits gives a 1 or a 2, where the v_dc_ref is calculared and the PID and PR controllers are used to control the converter power output. The scope acquisition is also done every 4 critical task cycles as indicated in.</w:t>
+        <w:t>The CLIENT board derives from the id_status if it should be in POWERMODE or in IDLEMODE. It is in POWERMODE if the last three bits gives a 1 or a 2</w:t>
+      </w:r>
+      <w:r>
+        <w:rPr>
+          <w:rFonts w:asciiTheme="minorHAnsi" w:hAnsiTheme="minorHAnsi" w:cstheme="minorHAnsi"/>
+          <w:color w:val="1F2328"/>
+          <w:sz w:val="22"/>
+          <w:szCs w:val="22"/>
+        </w:rPr>
+        <w:t>.</w:t>
       </w:r>
     </w:p>
     <w:p>
@@ -9098,7 +9364,598 @@
           <w:color w:val="CCCCCC"/>
           <w:sz w:val="21"/>
           <w:szCs w:val="21"/>
-          <w:lang w:val="fr-FR"/>
+        </w:rPr>
+      </w:pPr>
+      <w:r>
+        <w:rPr>
+          <w:rFonts w:ascii="Consolas" w:hAnsi="Consolas"/>
+          <w:color w:val="C586C0"/>
+          <w:sz w:val="21"/>
+          <w:szCs w:val="21"/>
+        </w:rPr>
+        <w:t>if</w:t>
+      </w:r>
+      <w:r>
+        <w:rPr>
+          <w:rFonts w:ascii="Consolas" w:hAnsi="Consolas"/>
+          <w:color w:val="CCCCCC"/>
+          <w:sz w:val="21"/>
+          <w:szCs w:val="21"/>
+        </w:rPr>
+        <w:t xml:space="preserve"> (</w:t>
+      </w:r>
+      <w:r>
+        <w:rPr>
+          <w:rFonts w:ascii="Consolas" w:hAnsi="Consolas"/>
+          <w:color w:val="9CDCFE"/>
+          <w:sz w:val="21"/>
+          <w:szCs w:val="21"/>
+        </w:rPr>
+        <w:t>record_counter</w:t>
+      </w:r>
+      <w:r>
+        <w:rPr>
+          <w:rFonts w:ascii="Consolas" w:hAnsi="Consolas"/>
+          <w:color w:val="CCCCCC"/>
+          <w:sz w:val="21"/>
+          <w:szCs w:val="21"/>
+        </w:rPr>
+        <w:t xml:space="preserve"> </w:t>
+      </w:r>
+      <w:r>
+        <w:rPr>
+          <w:rFonts w:ascii="Consolas" w:hAnsi="Consolas"/>
+          <w:color w:val="D4D4D4"/>
+          <w:sz w:val="21"/>
+          <w:szCs w:val="21"/>
+        </w:rPr>
+        <w:t>==</w:t>
+      </w:r>
+      <w:r>
+        <w:rPr>
+          <w:rFonts w:ascii="Consolas" w:hAnsi="Consolas"/>
+          <w:color w:val="CCCCCC"/>
+          <w:sz w:val="21"/>
+          <w:szCs w:val="21"/>
+        </w:rPr>
+        <w:t xml:space="preserve"> </w:t>
+      </w:r>
+      <w:r>
+        <w:rPr>
+          <w:rFonts w:ascii="Consolas" w:hAnsi="Consolas"/>
+          <w:color w:val="B5CEA8"/>
+          <w:sz w:val="21"/>
+          <w:szCs w:val="21"/>
+        </w:rPr>
+        <w:t>0</w:t>
+      </w:r>
+      <w:r>
+        <w:rPr>
+          <w:rFonts w:ascii="Consolas" w:hAnsi="Consolas"/>
+          <w:color w:val="CCCCCC"/>
+          <w:sz w:val="21"/>
+          <w:szCs w:val="21"/>
+        </w:rPr>
+        <w:t>)</w:t>
+      </w:r>
+    </w:p>
+    <w:p>
+      <w:pPr>
+        <w:shd w:val="clear" w:color="auto" w:fill="1F1F1F"/>
+        <w:spacing w:line="285" w:lineRule="atLeast"/>
+        <w:rPr>
+          <w:rFonts w:ascii="Consolas" w:hAnsi="Consolas"/>
+          <w:color w:val="CCCCCC"/>
+          <w:sz w:val="21"/>
+          <w:szCs w:val="21"/>
+        </w:rPr>
+      </w:pPr>
+      <w:r>
+        <w:rPr>
+          <w:rFonts w:ascii="Consolas" w:hAnsi="Consolas"/>
+          <w:color w:val="CCCCCC"/>
+          <w:sz w:val="21"/>
+          <w:szCs w:val="21"/>
+        </w:rPr>
+        <w:t xml:space="preserve">            </w:t>
+      </w:r>
+      <w:r>
+        <w:rPr>
+          <w:rFonts w:ascii="Consolas" w:hAnsi="Consolas"/>
+          <w:color w:val="9CDCFE"/>
+          <w:sz w:val="21"/>
+          <w:szCs w:val="21"/>
+        </w:rPr>
+        <w:t>tx_consigne</w:t>
+      </w:r>
+      <w:r>
+        <w:rPr>
+          <w:rFonts w:ascii="Consolas" w:hAnsi="Consolas"/>
+          <w:color w:val="CCCCCC"/>
+          <w:sz w:val="21"/>
+          <w:szCs w:val="21"/>
+        </w:rPr>
+        <w:t>.</w:t>
+      </w:r>
+      <w:r>
+        <w:rPr>
+          <w:rFonts w:ascii="Consolas" w:hAnsi="Consolas"/>
+          <w:color w:val="9CDCFE"/>
+          <w:sz w:val="21"/>
+          <w:szCs w:val="21"/>
+        </w:rPr>
+        <w:t>id_and_status</w:t>
+      </w:r>
+      <w:r>
+        <w:rPr>
+          <w:rFonts w:ascii="Consolas" w:hAnsi="Consolas"/>
+          <w:color w:val="CCCCCC"/>
+          <w:sz w:val="21"/>
+          <w:szCs w:val="21"/>
+        </w:rPr>
+        <w:t xml:space="preserve"> </w:t>
+      </w:r>
+      <w:r>
+        <w:rPr>
+          <w:rFonts w:ascii="Consolas" w:hAnsi="Consolas"/>
+          <w:color w:val="D4D4D4"/>
+          <w:sz w:val="21"/>
+          <w:szCs w:val="21"/>
+        </w:rPr>
+        <w:t>=</w:t>
+      </w:r>
+      <w:r>
+        <w:rPr>
+          <w:rFonts w:ascii="Consolas" w:hAnsi="Consolas"/>
+          <w:color w:val="CCCCCC"/>
+          <w:sz w:val="21"/>
+          <w:szCs w:val="21"/>
+        </w:rPr>
+        <w:t xml:space="preserve"> (</w:t>
+      </w:r>
+      <w:r>
+        <w:rPr>
+          <w:rFonts w:ascii="Consolas" w:hAnsi="Consolas"/>
+          <w:color w:val="B5CEA8"/>
+          <w:sz w:val="21"/>
+          <w:szCs w:val="21"/>
+        </w:rPr>
+        <w:t>1</w:t>
+      </w:r>
+      <w:r>
+        <w:rPr>
+          <w:rFonts w:ascii="Consolas" w:hAnsi="Consolas"/>
+          <w:color w:val="CCCCCC"/>
+          <w:sz w:val="21"/>
+          <w:szCs w:val="21"/>
+        </w:rPr>
+        <w:t xml:space="preserve"> </w:t>
+      </w:r>
+      <w:r>
+        <w:rPr>
+          <w:rFonts w:ascii="Consolas" w:hAnsi="Consolas"/>
+          <w:color w:val="D4D4D4"/>
+          <w:sz w:val="21"/>
+          <w:szCs w:val="21"/>
+        </w:rPr>
+        <w:t>&lt;&lt;</w:t>
+      </w:r>
+      <w:r>
+        <w:rPr>
+          <w:rFonts w:ascii="Consolas" w:hAnsi="Consolas"/>
+          <w:color w:val="CCCCCC"/>
+          <w:sz w:val="21"/>
+          <w:szCs w:val="21"/>
+        </w:rPr>
+        <w:t xml:space="preserve"> </w:t>
+      </w:r>
+      <w:r>
+        <w:rPr>
+          <w:rFonts w:ascii="Consolas" w:hAnsi="Consolas"/>
+          <w:color w:val="B5CEA8"/>
+          <w:sz w:val="21"/>
+          <w:szCs w:val="21"/>
+        </w:rPr>
+        <w:t>6</w:t>
+      </w:r>
+      <w:r>
+        <w:rPr>
+          <w:rFonts w:ascii="Consolas" w:hAnsi="Consolas"/>
+          <w:color w:val="CCCCCC"/>
+          <w:sz w:val="21"/>
+          <w:szCs w:val="21"/>
+        </w:rPr>
+        <w:t xml:space="preserve">) </w:t>
+      </w:r>
+      <w:r>
+        <w:rPr>
+          <w:rFonts w:ascii="Consolas" w:hAnsi="Consolas"/>
+          <w:color w:val="D4D4D4"/>
+          <w:sz w:val="21"/>
+          <w:szCs w:val="21"/>
+        </w:rPr>
+        <w:t>+</w:t>
+      </w:r>
+      <w:r>
+        <w:rPr>
+          <w:rFonts w:ascii="Consolas" w:hAnsi="Consolas"/>
+          <w:color w:val="CCCCCC"/>
+          <w:sz w:val="21"/>
+          <w:szCs w:val="21"/>
+        </w:rPr>
+        <w:t xml:space="preserve"> </w:t>
+      </w:r>
+      <w:r>
+        <w:rPr>
+          <w:rFonts w:ascii="Consolas" w:hAnsi="Consolas"/>
+          <w:color w:val="B5CEA8"/>
+          <w:sz w:val="21"/>
+          <w:szCs w:val="21"/>
+        </w:rPr>
+        <w:t>2</w:t>
+      </w:r>
+      <w:r>
+        <w:rPr>
+          <w:rFonts w:ascii="Consolas" w:hAnsi="Consolas"/>
+          <w:color w:val="CCCCCC"/>
+          <w:sz w:val="21"/>
+          <w:szCs w:val="21"/>
+        </w:rPr>
+        <w:t>;</w:t>
+      </w:r>
+    </w:p>
+    <w:p>
+      <w:pPr>
+        <w:shd w:val="clear" w:color="auto" w:fill="1F1F1F"/>
+        <w:spacing w:line="285" w:lineRule="atLeast"/>
+        <w:rPr>
+          <w:rFonts w:ascii="Consolas" w:hAnsi="Consolas"/>
+          <w:color w:val="CCCCCC"/>
+          <w:sz w:val="21"/>
+          <w:szCs w:val="21"/>
+        </w:rPr>
+      </w:pPr>
+      <w:r>
+        <w:rPr>
+          <w:rFonts w:ascii="Consolas" w:hAnsi="Consolas"/>
+          <w:color w:val="CCCCCC"/>
+          <w:sz w:val="21"/>
+          <w:szCs w:val="21"/>
+        </w:rPr>
+        <w:t xml:space="preserve">        </w:t>
+      </w:r>
+      <w:r>
+        <w:rPr>
+          <w:rFonts w:ascii="Consolas" w:hAnsi="Consolas"/>
+          <w:color w:val="C586C0"/>
+          <w:sz w:val="21"/>
+          <w:szCs w:val="21"/>
+        </w:rPr>
+        <w:t>else</w:t>
+      </w:r>
+    </w:p>
+    <w:p>
+      <w:pPr>
+        <w:shd w:val="clear" w:color="auto" w:fill="1F1F1F"/>
+        <w:spacing w:line="285" w:lineRule="atLeast"/>
+        <w:rPr>
+          <w:rFonts w:ascii="Consolas" w:hAnsi="Consolas"/>
+          <w:color w:val="CCCCCC"/>
+          <w:sz w:val="21"/>
+          <w:szCs w:val="21"/>
+        </w:rPr>
+      </w:pPr>
+      <w:r>
+        <w:rPr>
+          <w:rFonts w:ascii="Consolas" w:hAnsi="Consolas"/>
+          <w:color w:val="CCCCCC"/>
+          <w:sz w:val="21"/>
+          <w:szCs w:val="21"/>
+        </w:rPr>
+        <w:t xml:space="preserve">            </w:t>
+      </w:r>
+      <w:r>
+        <w:rPr>
+          <w:rFonts w:ascii="Consolas" w:hAnsi="Consolas"/>
+          <w:color w:val="9CDCFE"/>
+          <w:sz w:val="21"/>
+          <w:szCs w:val="21"/>
+        </w:rPr>
+        <w:t>tx_consigne</w:t>
+      </w:r>
+      <w:r>
+        <w:rPr>
+          <w:rFonts w:ascii="Consolas" w:hAnsi="Consolas"/>
+          <w:color w:val="CCCCCC"/>
+          <w:sz w:val="21"/>
+          <w:szCs w:val="21"/>
+        </w:rPr>
+        <w:t>.</w:t>
+      </w:r>
+      <w:r>
+        <w:rPr>
+          <w:rFonts w:ascii="Consolas" w:hAnsi="Consolas"/>
+          <w:color w:val="9CDCFE"/>
+          <w:sz w:val="21"/>
+          <w:szCs w:val="21"/>
+        </w:rPr>
+        <w:t>id_and_status</w:t>
+      </w:r>
+      <w:r>
+        <w:rPr>
+          <w:rFonts w:ascii="Consolas" w:hAnsi="Consolas"/>
+          <w:color w:val="CCCCCC"/>
+          <w:sz w:val="21"/>
+          <w:szCs w:val="21"/>
+        </w:rPr>
+        <w:t xml:space="preserve"> </w:t>
+      </w:r>
+      <w:r>
+        <w:rPr>
+          <w:rFonts w:ascii="Consolas" w:hAnsi="Consolas"/>
+          <w:color w:val="D4D4D4"/>
+          <w:sz w:val="21"/>
+          <w:szCs w:val="21"/>
+        </w:rPr>
+        <w:t>=</w:t>
+      </w:r>
+      <w:r>
+        <w:rPr>
+          <w:rFonts w:ascii="Consolas" w:hAnsi="Consolas"/>
+          <w:color w:val="CCCCCC"/>
+          <w:sz w:val="21"/>
+          <w:szCs w:val="21"/>
+        </w:rPr>
+        <w:t xml:space="preserve"> (</w:t>
+      </w:r>
+      <w:r>
+        <w:rPr>
+          <w:rFonts w:ascii="Consolas" w:hAnsi="Consolas"/>
+          <w:color w:val="B5CEA8"/>
+          <w:sz w:val="21"/>
+          <w:szCs w:val="21"/>
+        </w:rPr>
+        <w:t>1</w:t>
+      </w:r>
+      <w:r>
+        <w:rPr>
+          <w:rFonts w:ascii="Consolas" w:hAnsi="Consolas"/>
+          <w:color w:val="CCCCCC"/>
+          <w:sz w:val="21"/>
+          <w:szCs w:val="21"/>
+        </w:rPr>
+        <w:t xml:space="preserve"> </w:t>
+      </w:r>
+      <w:r>
+        <w:rPr>
+          <w:rFonts w:ascii="Consolas" w:hAnsi="Consolas"/>
+          <w:color w:val="D4D4D4"/>
+          <w:sz w:val="21"/>
+          <w:szCs w:val="21"/>
+        </w:rPr>
+        <w:t>&lt;&lt;</w:t>
+      </w:r>
+      <w:r>
+        <w:rPr>
+          <w:rFonts w:ascii="Consolas" w:hAnsi="Consolas"/>
+          <w:color w:val="CCCCCC"/>
+          <w:sz w:val="21"/>
+          <w:szCs w:val="21"/>
+        </w:rPr>
+        <w:t xml:space="preserve"> </w:t>
+      </w:r>
+      <w:r>
+        <w:rPr>
+          <w:rFonts w:ascii="Consolas" w:hAnsi="Consolas"/>
+          <w:color w:val="B5CEA8"/>
+          <w:sz w:val="21"/>
+          <w:szCs w:val="21"/>
+        </w:rPr>
+        <w:t>6</w:t>
+      </w:r>
+      <w:r>
+        <w:rPr>
+          <w:rFonts w:ascii="Consolas" w:hAnsi="Consolas"/>
+          <w:color w:val="CCCCCC"/>
+          <w:sz w:val="21"/>
+          <w:szCs w:val="21"/>
+        </w:rPr>
+        <w:t xml:space="preserve">) </w:t>
+      </w:r>
+      <w:r>
+        <w:rPr>
+          <w:rFonts w:ascii="Consolas" w:hAnsi="Consolas"/>
+          <w:color w:val="D4D4D4"/>
+          <w:sz w:val="21"/>
+          <w:szCs w:val="21"/>
+        </w:rPr>
+        <w:t>+</w:t>
+      </w:r>
+      <w:r>
+        <w:rPr>
+          <w:rFonts w:ascii="Consolas" w:hAnsi="Consolas"/>
+          <w:color w:val="CCCCCC"/>
+          <w:sz w:val="21"/>
+          <w:szCs w:val="21"/>
+        </w:rPr>
+        <w:t xml:space="preserve"> </w:t>
+      </w:r>
+      <w:r>
+        <w:rPr>
+          <w:rFonts w:ascii="Consolas" w:hAnsi="Consolas"/>
+          <w:color w:val="B5CEA8"/>
+          <w:sz w:val="21"/>
+          <w:szCs w:val="21"/>
+        </w:rPr>
+        <w:t>1</w:t>
+      </w:r>
+      <w:r>
+        <w:rPr>
+          <w:rFonts w:ascii="Consolas" w:hAnsi="Consolas"/>
+          <w:color w:val="CCCCCC"/>
+          <w:sz w:val="21"/>
+          <w:szCs w:val="21"/>
+        </w:rPr>
+        <w:t>;</w:t>
+      </w:r>
+    </w:p>
+    <w:p>
+      <w:pPr>
+        <w:shd w:val="clear" w:color="auto" w:fill="FFFFFF"/>
+        <w:spacing w:beforeAutospacing="1" w:afterAutospacing="1"/>
+        <w:rPr>
+          <w:rFonts w:asciiTheme="minorHAnsi" w:hAnsiTheme="minorHAnsi" w:cstheme="minorHAnsi"/>
+          <w:color w:val="1F2328"/>
+          <w:sz w:val="22"/>
+          <w:szCs w:val="22"/>
+        </w:rPr>
+      </w:pPr>
+    </w:p>
+    <w:p>
+      <w:pPr>
+        <w:numPr>
+          <w:ilvl w:val="0"/>
+          <w:numId w:val="29"/>
+        </w:numPr>
+        <w:shd w:val="clear" w:color="auto" w:fill="FFFFFF"/>
+        <w:spacing w:beforeAutospacing="1" w:afterAutospacing="1"/>
+        <w:rPr>
+          <w:rFonts w:asciiTheme="minorHAnsi" w:hAnsiTheme="minorHAnsi" w:cstheme="minorHAnsi"/>
+          <w:color w:val="1F2328"/>
+          <w:sz w:val="22"/>
+          <w:szCs w:val="22"/>
+        </w:rPr>
+      </w:pPr>
+      <w:r>
+        <w:rPr>
+          <w:rFonts w:asciiTheme="minorHAnsi" w:hAnsiTheme="minorHAnsi" w:cstheme="minorHAnsi"/>
+          <w:color w:val="1F2328"/>
+          <w:sz w:val="22"/>
+          <w:szCs w:val="22"/>
+        </w:rPr>
+        <w:t>During POWERMODE</w:t>
+      </w:r>
+      <w:r>
+        <w:rPr>
+          <w:rFonts w:asciiTheme="minorHAnsi" w:hAnsiTheme="minorHAnsi" w:cstheme="minorHAnsi"/>
+          <w:color w:val="1F2328"/>
+          <w:sz w:val="22"/>
+          <w:szCs w:val="22"/>
+        </w:rPr>
+        <w:t xml:space="preserve"> for the CLIENT</w:t>
+      </w:r>
+      <w:r>
+        <w:rPr>
+          <w:rFonts w:asciiTheme="minorHAnsi" w:hAnsiTheme="minorHAnsi" w:cstheme="minorHAnsi"/>
+          <w:color w:val="1F2328"/>
+          <w:sz w:val="22"/>
+          <w:szCs w:val="22"/>
+        </w:rPr>
+        <w:t>:</w:t>
+      </w:r>
+    </w:p>
+    <w:p>
+      <w:pPr>
+        <w:numPr>
+          <w:ilvl w:val="1"/>
+          <w:numId w:val="29"/>
+        </w:numPr>
+        <w:shd w:val="clear" w:color="auto" w:fill="FFFFFF"/>
+        <w:spacing w:beforeAutospacing="1" w:afterAutospacing="1"/>
+        <w:rPr>
+          <w:rFonts w:asciiTheme="minorHAnsi" w:hAnsiTheme="minorHAnsi" w:cstheme="minorHAnsi"/>
+          <w:color w:val="1F2328"/>
+          <w:sz w:val="22"/>
+          <w:szCs w:val="22"/>
+        </w:rPr>
+      </w:pPr>
+      <w:r>
+        <w:rPr>
+          <w:rFonts w:asciiTheme="minorHAnsi" w:hAnsiTheme="minorHAnsi" w:cstheme="minorHAnsi"/>
+          <w:color w:val="1F2328"/>
+          <w:sz w:val="22"/>
+          <w:szCs w:val="22"/>
+        </w:rPr>
+        <w:t>T</w:t>
+      </w:r>
+      <w:r>
+        <w:rPr>
+          <w:rFonts w:asciiTheme="minorHAnsi" w:hAnsiTheme="minorHAnsi" w:cstheme="minorHAnsi"/>
+          <w:color w:val="1F2328"/>
+          <w:sz w:val="22"/>
+          <w:szCs w:val="22"/>
+        </w:rPr>
+        <w:t>he v_dc_ref is calculared</w:t>
+      </w:r>
+    </w:p>
+    <w:p>
+      <w:pPr>
+        <w:numPr>
+          <w:ilvl w:val="1"/>
+          <w:numId w:val="29"/>
+        </w:numPr>
+        <w:shd w:val="clear" w:color="auto" w:fill="FFFFFF"/>
+        <w:spacing w:beforeAutospacing="1" w:afterAutospacing="1"/>
+        <w:rPr>
+          <w:rFonts w:asciiTheme="minorHAnsi" w:hAnsiTheme="minorHAnsi" w:cstheme="minorHAnsi"/>
+          <w:color w:val="1F2328"/>
+          <w:sz w:val="22"/>
+          <w:szCs w:val="22"/>
+        </w:rPr>
+      </w:pPr>
+      <w:r>
+        <w:rPr>
+          <w:rFonts w:asciiTheme="minorHAnsi" w:hAnsiTheme="minorHAnsi" w:cstheme="minorHAnsi"/>
+          <w:color w:val="1F2328"/>
+          <w:sz w:val="22"/>
+          <w:szCs w:val="22"/>
+        </w:rPr>
+        <w:t>T</w:t>
+      </w:r>
+      <w:r>
+        <w:rPr>
+          <w:rFonts w:asciiTheme="minorHAnsi" w:hAnsiTheme="minorHAnsi" w:cstheme="minorHAnsi"/>
+          <w:color w:val="1F2328"/>
+          <w:sz w:val="22"/>
+          <w:szCs w:val="22"/>
+        </w:rPr>
+        <w:t>he PID and PR controllers are used to control the converter power output.</w:t>
+      </w:r>
+    </w:p>
+    <w:p>
+      <w:pPr>
+        <w:numPr>
+          <w:ilvl w:val="1"/>
+          <w:numId w:val="29"/>
+        </w:numPr>
+        <w:shd w:val="clear" w:color="auto" w:fill="FFFFFF"/>
+        <w:spacing w:beforeAutospacing="1" w:afterAutospacing="1"/>
+        <w:rPr>
+          <w:rFonts w:asciiTheme="minorHAnsi" w:hAnsiTheme="minorHAnsi" w:cstheme="minorHAnsi"/>
+          <w:color w:val="1F2328"/>
+          <w:sz w:val="22"/>
+          <w:szCs w:val="22"/>
+        </w:rPr>
+      </w:pPr>
+      <w:r>
+        <w:rPr>
+          <w:rFonts w:asciiTheme="minorHAnsi" w:hAnsiTheme="minorHAnsi" w:cstheme="minorHAnsi"/>
+          <w:color w:val="1F2328"/>
+          <w:sz w:val="22"/>
+          <w:szCs w:val="22"/>
+        </w:rPr>
+        <w:t>The scope acquisition is also done every 4 critical task cycles as indicated in.</w:t>
+      </w:r>
+    </w:p>
+    <w:p>
+      <w:pPr>
+        <w:shd w:val="clear" w:color="auto" w:fill="1F1F1F"/>
+        <w:spacing w:line="285" w:lineRule="atLeast"/>
+        <w:rPr>
+          <w:rFonts w:ascii="Consolas" w:hAnsi="Consolas"/>
+          <w:color w:val="CCCCCC"/>
+          <w:sz w:val="21"/>
+          <w:szCs w:val="21"/>
         </w:rPr>
       </w:pPr>
       <w:r>
@@ -9211,6 +10068,7 @@
       </w:pPr>
       <w:bookmarkStart w:id="10" w:name="_Toc201101246"/>
       <w:r>
+        <w:lastRenderedPageBreak/>
         <w:t>Connect hardware and Power up</w:t>
       </w:r>
       <w:bookmarkEnd w:id="10"/>
@@ -9308,7 +10166,25 @@
           <w:sz w:val="22"/>
           <w:szCs w:val="22"/>
         </w:rPr>
-        <w:t>to the DC power supply (set current limit to 1 A).</w:t>
+        <w:t xml:space="preserve">to the DC power supply (set current limit to </w:t>
+      </w:r>
+      <w:r>
+        <w:rPr>
+          <w:rFonts w:asciiTheme="minorHAnsi" w:hAnsiTheme="minorHAnsi" w:cstheme="minorHAnsi"/>
+          <w:color w:val="1F2328"/>
+          <w:sz w:val="22"/>
+          <w:szCs w:val="22"/>
+        </w:rPr>
+        <w:t>2</w:t>
+      </w:r>
+      <w:r>
+        <w:rPr>
+          <w:rFonts w:asciiTheme="minorHAnsi" w:hAnsiTheme="minorHAnsi" w:cstheme="minorHAnsi"/>
+          <w:color w:val="1F2328"/>
+          <w:sz w:val="22"/>
+          <w:szCs w:val="22"/>
+        </w:rPr>
+        <w:t xml:space="preserve"> A).</w:t>
       </w:r>
     </w:p>
     <w:p>
@@ -9360,16 +10236,7 @@
           <w:sz w:val="22"/>
           <w:szCs w:val="22"/>
         </w:rPr>
-        <w:t>CLIENT</w:t>
-      </w:r>
-      <w:r>
-        <w:rPr>
-          <w:rFonts w:asciiTheme="minorHAnsi" w:hAnsiTheme="minorHAnsi" w:cstheme="minorHAnsi"/>
-          <w:color w:val="1F2328"/>
-          <w:sz w:val="22"/>
-          <w:szCs w:val="22"/>
-        </w:rPr>
-        <w:t xml:space="preserve"> TWIST board </w:t>
+        <w:t xml:space="preserve">CLIENT TWIST board </w:t>
       </w:r>
       <w:r>
         <w:rPr>
@@ -9500,16 +10367,7 @@
           <w:sz w:val="22"/>
           <w:szCs w:val="22"/>
         </w:rPr>
-        <w:t xml:space="preserve"> of the </w:t>
-      </w:r>
-      <w:r>
-        <w:rPr>
-          <w:rFonts w:asciiTheme="minorHAnsi" w:hAnsiTheme="minorHAnsi" w:cstheme="minorHAnsi"/>
-          <w:color w:val="1F2328"/>
-          <w:sz w:val="22"/>
-          <w:szCs w:val="22"/>
-        </w:rPr>
-        <w:t>SERVER board</w:t>
+        <w:t xml:space="preserve"> of the SERVER board</w:t>
       </w:r>
       <w:r>
         <w:rPr>
@@ -9543,7 +10401,25 @@
           <w:sz w:val="22"/>
           <w:szCs w:val="22"/>
         </w:rPr>
-        <w:t>Turn on the DC power supply. Choose a voltage between 0 and 48 V.</w:t>
+        <w:t>Turn on the DC power supply</w:t>
+      </w:r>
+      <w:r>
+        <w:rPr>
+          <w:rFonts w:asciiTheme="minorHAnsi" w:hAnsiTheme="minorHAnsi" w:cstheme="minorHAnsi"/>
+          <w:color w:val="1F2328"/>
+          <w:sz w:val="22"/>
+          <w:szCs w:val="22"/>
+        </w:rPr>
+        <w:t xml:space="preserve"> at 50 </w:t>
+      </w:r>
+      <w:r>
+        <w:rPr>
+          <w:rFonts w:asciiTheme="minorHAnsi" w:hAnsiTheme="minorHAnsi" w:cstheme="minorHAnsi"/>
+          <w:color w:val="1F2328"/>
+          <w:sz w:val="22"/>
+          <w:szCs w:val="22"/>
+        </w:rPr>
+        <w:t>V.</w:t>
       </w:r>
     </w:p>
     <w:p>
@@ -9559,9 +10435,9 @@
       <w:r>
         <w:rPr>
           <w:rFonts w:ascii="Segoe UI" w:hAnsi="Segoe UI" w:cs="Segoe UI"/>
-          <w:color w:val="1F2328"/>
-        </w:rPr>
-        <w:lastRenderedPageBreak/>
+          <w:noProof/>
+          <w:color w:val="1F2328"/>
+        </w:rPr>
         <w:drawing>
           <wp:inline distT="0" distB="0" distL="0" distR="0" wp14:anchorId="49B46B74" wp14:editId="52262010">
             <wp:extent cx="5760720" cy="3187700"/>
@@ -9633,6 +10509,7 @@
       <w:r>
         <w:rPr>
           <w:rFonts w:asciiTheme="minorHAnsi" w:hAnsiTheme="minorHAnsi" w:cstheme="minorHAnsi"/>
+          <w:noProof/>
           <w:color w:val="1F2328"/>
           <w:sz w:val="22"/>
         </w:rPr>
@@ -9704,6 +10581,7 @@
       <w:r>
         <w:rPr>
           <w:rFonts w:asciiTheme="minorHAnsi" w:hAnsiTheme="minorHAnsi" w:cstheme="minorHAnsi"/>
+          <w:noProof/>
           <w:color w:val="1F2328"/>
           <w:sz w:val="22"/>
         </w:rPr>
@@ -10027,7 +10905,7 @@
         <w:sz w:val="20"/>
       </w:rPr>
     </w:lvl>
-    <w:lvl w:ilvl="1" w:tentative="1">
+    <w:lvl w:ilvl="1">
       <w:start w:val="1"/>
       <w:numFmt w:val="bullet"/>
       <w:lvlText w:val="o"/>
@@ -19874,6 +20752,7 @@
   <w:style w:type="character" w:default="1" w:styleId="Policepardfaut">
     <w:name w:val="Default Paragraph Font"/>
     <w:uiPriority w:val="1"/>
+    <w:semiHidden/>
     <w:unhideWhenUsed/>
   </w:style>
   <w:style w:type="table" w:default="1" w:styleId="TableauNormal">
@@ -20621,6 +21500,10 @@
 </file>
 
 <file path=customXml/item1.xml><?xml version="1.0" encoding="utf-8"?>
+<b:Sources xmlns:b="http://schemas.openxmlformats.org/officeDocument/2006/bibliography" xmlns="http://schemas.openxmlformats.org/officeDocument/2006/bibliography" SelectedStyle="\APASixthEditionOfficeOnline.xsl" StyleName="APA" Version="6"/>
+</file>
+
+<file path=customXml/item2.xml><?xml version="1.0" encoding="utf-8"?>
 <ct:contentTypeSchema xmlns:ct="http://schemas.microsoft.com/office/2006/metadata/contentType" xmlns:ma="http://schemas.microsoft.com/office/2006/metadata/properties/metaAttributes" ct:_="" ma:_="" ma:contentTypeName="Document" ma:contentTypeID="0x01010091E8391441C3C848AE6F0DBA38E1AB2A" ma:contentTypeVersion="3" ma:contentTypeDescription="Crée un document." ma:contentTypeScope="" ma:versionID="17e5843485efa152481956cb4ee20980">
   <xsd:schema xmlns:xsd="http://www.w3.org/2001/XMLSchema" xmlns:xs="http://www.w3.org/2001/XMLSchema" xmlns:p="http://schemas.microsoft.com/office/2006/metadata/properties" xmlns:ns2="bb916332-0d70-4601-9edb-bb0f91fb01d1" targetNamespace="http://schemas.microsoft.com/office/2006/metadata/properties" ma:root="true" ma:fieldsID="833239ef7662a9616b9fdb567fa02258" ns2:_="">
     <xsd:import namespace="bb916332-0d70-4601-9edb-bb0f91fb01d1"/>
@@ -20758,17 +21641,7 @@
 </ct:contentTypeSchema>
 </file>
 
-<file path=customXml/item2.xml><?xml version="1.0" encoding="utf-8"?>
-<b:Sources xmlns:b="http://schemas.openxmlformats.org/officeDocument/2006/bibliography" xmlns="http://schemas.openxmlformats.org/officeDocument/2006/bibliography" SelectedStyle="\APASixthEditionOfficeOnline.xsl" StyleName="APA" Version="6"/>
-</file>
-
 <file path=customXml/item3.xml><?xml version="1.0" encoding="utf-8"?>
-<p:properties xmlns:p="http://schemas.microsoft.com/office/2006/metadata/properties" xmlns:xsi="http://www.w3.org/2001/XMLSchema-instance" xmlns:pc="http://schemas.microsoft.com/office/infopath/2007/PartnerControls">
-  <documentManagement/>
-</p:properties>
-</file>
-
-<file path=customXml/item4.xml><?xml version="1.0" encoding="utf-8"?>
 <?mso-contentType ?>
 <FormTemplates xmlns="http://schemas.microsoft.com/sharepoint/v3/contenttype/forms">
   <Display>DocumentLibraryForm</Display>
@@ -20777,7 +21650,21 @@
 </FormTemplates>
 </file>
 
+<file path=customXml/item4.xml><?xml version="1.0" encoding="utf-8"?>
+<p:properties xmlns:p="http://schemas.microsoft.com/office/2006/metadata/properties" xmlns:xsi="http://www.w3.org/2001/XMLSchema-instance" xmlns:pc="http://schemas.microsoft.com/office/infopath/2007/PartnerControls">
+  <documentManagement/>
+</p:properties>
+</file>
+
 <file path=customXml/itemProps1.xml><?xml version="1.0" encoding="utf-8"?>
+<ds:datastoreItem xmlns:ds="http://schemas.openxmlformats.org/officeDocument/2006/customXml" ds:itemID="{D5966EB9-C0AA-49BD-8D41-0467B53A08E0}">
+  <ds:schemaRefs>
+    <ds:schemaRef ds:uri="http://schemas.openxmlformats.org/officeDocument/2006/bibliography"/>
+  </ds:schemaRefs>
+</ds:datastoreItem>
+</file>
+
+<file path=customXml/itemProps2.xml><?xml version="1.0" encoding="utf-8"?>
 <ds:datastoreItem xmlns:ds="http://schemas.openxmlformats.org/officeDocument/2006/customXml" ds:itemID="{08E180BE-9299-4A1E-808B-74C40609AA4D}">
   <ds:schemaRefs>
     <ds:schemaRef ds:uri="http://schemas.microsoft.com/office/2006/metadata/contentType"/>
@@ -20795,27 +21682,19 @@
 </ds:datastoreItem>
 </file>
 
-<file path=customXml/itemProps2.xml><?xml version="1.0" encoding="utf-8"?>
-<ds:datastoreItem xmlns:ds="http://schemas.openxmlformats.org/officeDocument/2006/customXml" ds:itemID="{D5966EB9-C0AA-49BD-8D41-0467B53A08E0}">
+<file path=customXml/itemProps3.xml><?xml version="1.0" encoding="utf-8"?>
+<ds:datastoreItem xmlns:ds="http://schemas.openxmlformats.org/officeDocument/2006/customXml" ds:itemID="{7FA20336-33C6-4E40-8EDD-AD79122ECB07}">
   <ds:schemaRefs>
-    <ds:schemaRef ds:uri="http://schemas.openxmlformats.org/officeDocument/2006/bibliography"/>
+    <ds:schemaRef ds:uri="http://schemas.microsoft.com/sharepoint/v3/contenttype/forms"/>
   </ds:schemaRefs>
 </ds:datastoreItem>
 </file>
 
-<file path=customXml/itemProps3.xml><?xml version="1.0" encoding="utf-8"?>
+<file path=customXml/itemProps4.xml><?xml version="1.0" encoding="utf-8"?>
 <ds:datastoreItem xmlns:ds="http://schemas.openxmlformats.org/officeDocument/2006/customXml" ds:itemID="{34093086-089D-45DF-ACA3-088DB9B15E30}">
   <ds:schemaRefs>
     <ds:schemaRef ds:uri="http://schemas.microsoft.com/office/2006/metadata/properties"/>
     <ds:schemaRef ds:uri="http://schemas.microsoft.com/office/infopath/2007/PartnerControls"/>
   </ds:schemaRefs>
 </ds:datastoreItem>
-</file>
-
-<file path=customXml/itemProps4.xml><?xml version="1.0" encoding="utf-8"?>
-<ds:datastoreItem xmlns:ds="http://schemas.openxmlformats.org/officeDocument/2006/customXml" ds:itemID="{7FA20336-33C6-4E40-8EDD-AD79122ECB07}">
-  <ds:schemaRefs>
-    <ds:schemaRef ds:uri="http://schemas.microsoft.com/sharepoint/v3/contenttype/forms"/>
-  </ds:schemaRefs>
-</ds:datastoreItem>
 </file>
</xml_diff>